<commit_message>
added ui/ux changes (modals and notifs) more rbac controls and restrictions and upadted quickstart
</commit_message>
<xml_diff>
--- a/app/templates/FACILITIES-AND-UTILIZATION-FORM-TEMPLATE.docx
+++ b/app/templates/FACILITIES-AND-UTILIZATION-FORM-TEMPLATE.docx
@@ -455,15 +455,15 @@
               <w:tblLook w:val="04A0" w:firstRow="1" w:lastRow="0" w:firstColumn="1" w:lastColumn="0" w:noHBand="0" w:noVBand="1"/>
             </w:tblPr>
             <w:tblGrid>
-              <w:gridCol w:w="480"/>
+              <w:gridCol w:w="1784"/>
             </w:tblGrid>
             <w:tr>
               <w:trPr>
-                <w:trHeight w:val="339"/>
+                <w:trHeight w:val="338"/>
               </w:trPr>
               <w:tc>
                 <w:tcPr>
-                  <w:tcW w:w="480" w:type="dxa"/>
+                  <w:tcW w:w="510" w:type="dxa"/>
                 </w:tcPr>
                 <w:p>
                   <w:pPr>
@@ -474,16 +474,42 @@
                       <w:szCs w:val="22"/>
                     </w:rPr>
                   </w:pPr>
+                  <w:r>
+                    <w:rPr>
+                      <w:rFonts w:ascii="Times New Roman" w:hAnsi="Times New Roman" w:cs="Times New Roman"/>
+                      <w:sz w:val="22"/>
+                      <w:szCs w:val="22"/>
+                    </w:rPr>
+                    <w:t>${</w:t>
+                  </w:r>
+                  <w:proofErr w:type="spellStart"/>
+                  <w:r>
+                    <w:rPr>
+                      <w:rFonts w:ascii="Times New Roman" w:hAnsi="Times New Roman" w:cs="Times New Roman"/>
+                      <w:sz w:val="22"/>
+                      <w:szCs w:val="22"/>
+                    </w:rPr>
+                    <w:t>busalian_hall</w:t>
+                  </w:r>
+                  <w:proofErr w:type="spellEnd"/>
+                  <w:r>
+                    <w:rPr>
+                      <w:rFonts w:ascii="Times New Roman" w:hAnsi="Times New Roman" w:cs="Times New Roman"/>
+                      <w:sz w:val="22"/>
+                      <w:szCs w:val="22"/>
+                    </w:rPr>
+                    <w:t>}</w:t>
+                  </w:r>
                 </w:p>
               </w:tc>
             </w:tr>
             <w:tr>
               <w:trPr>
-                <w:trHeight w:val="339"/>
+                <w:trHeight w:val="338"/>
               </w:trPr>
               <w:tc>
                 <w:tcPr>
-                  <w:tcW w:w="480" w:type="dxa"/>
+                  <w:tcW w:w="510" w:type="dxa"/>
                 </w:tcPr>
                 <w:p>
                   <w:pPr>
@@ -494,16 +520,42 @@
                       <w:szCs w:val="22"/>
                     </w:rPr>
                   </w:pPr>
+                  <w:r>
+                    <w:rPr>
+                      <w:rFonts w:ascii="Times New Roman" w:hAnsi="Times New Roman" w:cs="Times New Roman"/>
+                      <w:sz w:val="22"/>
+                      <w:szCs w:val="22"/>
+                    </w:rPr>
+                    <w:t>${</w:t>
+                  </w:r>
+                  <w:proofErr w:type="spellStart"/>
+                  <w:r>
+                    <w:rPr>
+                      <w:rFonts w:ascii="Times New Roman" w:hAnsi="Times New Roman" w:cs="Times New Roman"/>
+                      <w:sz w:val="22"/>
+                      <w:szCs w:val="22"/>
+                    </w:rPr>
+                    <w:t>paghiusa_hall</w:t>
+                  </w:r>
+                  <w:proofErr w:type="spellEnd"/>
+                  <w:r>
+                    <w:rPr>
+                      <w:rFonts w:ascii="Times New Roman" w:hAnsi="Times New Roman" w:cs="Times New Roman"/>
+                      <w:sz w:val="22"/>
+                      <w:szCs w:val="22"/>
+                    </w:rPr>
+                    <w:t>}</w:t>
+                  </w:r>
                 </w:p>
               </w:tc>
             </w:tr>
             <w:tr>
               <w:trPr>
-                <w:trHeight w:val="339"/>
+                <w:trHeight w:val="338"/>
               </w:trPr>
               <w:tc>
                 <w:tcPr>
-                  <w:tcW w:w="480" w:type="dxa"/>
+                  <w:tcW w:w="510" w:type="dxa"/>
                 </w:tcPr>
                 <w:p>
                   <w:pPr>
@@ -514,16 +566,42 @@
                       <w:szCs w:val="22"/>
                     </w:rPr>
                   </w:pPr>
+                  <w:r>
+                    <w:rPr>
+                      <w:rFonts w:ascii="Times New Roman" w:hAnsi="Times New Roman" w:cs="Times New Roman"/>
+                      <w:sz w:val="22"/>
+                      <w:szCs w:val="22"/>
+                    </w:rPr>
+                    <w:t>${</w:t>
+                  </w:r>
+                  <w:proofErr w:type="spellStart"/>
+                  <w:r>
+                    <w:rPr>
+                      <w:rFonts w:ascii="Times New Roman" w:hAnsi="Times New Roman" w:cs="Times New Roman"/>
+                      <w:sz w:val="22"/>
+                      <w:szCs w:val="22"/>
+                    </w:rPr>
+                    <w:t>ehub</w:t>
+                  </w:r>
+                  <w:proofErr w:type="spellEnd"/>
+                  <w:r>
+                    <w:rPr>
+                      <w:rFonts w:ascii="Times New Roman" w:hAnsi="Times New Roman" w:cs="Times New Roman"/>
+                      <w:sz w:val="22"/>
+                      <w:szCs w:val="22"/>
+                    </w:rPr>
+                    <w:t>}</w:t>
+                  </w:r>
                 </w:p>
               </w:tc>
             </w:tr>
             <w:tr>
               <w:trPr>
-                <w:trHeight w:val="348"/>
+                <w:trHeight w:val="347"/>
               </w:trPr>
               <w:tc>
                 <w:tcPr>
-                  <w:tcW w:w="480" w:type="dxa"/>
+                  <w:tcW w:w="510" w:type="dxa"/>
                 </w:tcPr>
                 <w:p>
                   <w:pPr>
@@ -534,6 +612,32 @@
                       <w:szCs w:val="22"/>
                     </w:rPr>
                   </w:pPr>
+                  <w:r>
+                    <w:rPr>
+                      <w:rFonts w:ascii="Times New Roman" w:hAnsi="Times New Roman" w:cs="Times New Roman"/>
+                      <w:sz w:val="22"/>
+                      <w:szCs w:val="22"/>
+                    </w:rPr>
+                    <w:t>${</w:t>
+                  </w:r>
+                  <w:proofErr w:type="spellStart"/>
+                  <w:r>
+                    <w:rPr>
+                      <w:rFonts w:ascii="Times New Roman" w:hAnsi="Times New Roman" w:cs="Times New Roman"/>
+                      <w:sz w:val="22"/>
+                      <w:szCs w:val="22"/>
+                    </w:rPr>
+                    <w:t>balay_ni_juan</w:t>
+                  </w:r>
+                  <w:proofErr w:type="spellEnd"/>
+                  <w:r>
+                    <w:rPr>
+                      <w:rFonts w:ascii="Times New Roman" w:hAnsi="Times New Roman" w:cs="Times New Roman"/>
+                      <w:sz w:val="22"/>
+                      <w:szCs w:val="22"/>
+                    </w:rPr>
+                    <w:t>}</w:t>
+                  </w:r>
                 </w:p>
               </w:tc>
             </w:tr>
@@ -541,13 +645,13 @@
           <w:tbl>
             <w:tblPr>
               <w:tblStyle w:val="TableGrid"/>
-              <w:tblpPr w:leftFromText="180" w:rightFromText="180" w:vertAnchor="text" w:horzAnchor="page" w:tblpX="4333" w:tblpY="243"/>
+              <w:tblpPr w:leftFromText="180" w:rightFromText="180" w:vertAnchor="text" w:horzAnchor="margin" w:tblpXSpec="center" w:tblpY="348"/>
               <w:tblOverlap w:val="never"/>
               <w:tblW w:w="0" w:type="auto"/>
               <w:tblLook w:val="04A0" w:firstRow="1" w:lastRow="0" w:firstColumn="1" w:lastColumn="0" w:noHBand="0" w:noVBand="1"/>
             </w:tblPr>
             <w:tblGrid>
-              <w:gridCol w:w="400"/>
+              <w:gridCol w:w="1295"/>
             </w:tblGrid>
             <w:tr>
               <w:trPr>
@@ -555,7 +659,7 @@
               </w:trPr>
               <w:tc>
                 <w:tcPr>
-                  <w:tcW w:w="400" w:type="dxa"/>
+                  <w:tcW w:w="535" w:type="dxa"/>
                 </w:tcPr>
                 <w:p>
                   <w:pPr>
@@ -566,6 +670,32 @@
                       <w:szCs w:val="22"/>
                     </w:rPr>
                   </w:pPr>
+                  <w:r>
+                    <w:rPr>
+                      <w:rFonts w:ascii="Times New Roman" w:hAnsi="Times New Roman" w:cs="Times New Roman"/>
+                      <w:sz w:val="22"/>
+                      <w:szCs w:val="22"/>
+                    </w:rPr>
+                    <w:t>${</w:t>
+                  </w:r>
+                  <w:proofErr w:type="spellStart"/>
+                  <w:r>
+                    <w:rPr>
+                      <w:rFonts w:ascii="Times New Roman" w:hAnsi="Times New Roman" w:cs="Times New Roman"/>
+                      <w:sz w:val="22"/>
+                      <w:szCs w:val="22"/>
+                    </w:rPr>
+                    <w:t>ict_avr</w:t>
+                  </w:r>
+                  <w:proofErr w:type="spellEnd"/>
+                  <w:r>
+                    <w:rPr>
+                      <w:rFonts w:ascii="Times New Roman" w:hAnsi="Times New Roman" w:cs="Times New Roman"/>
+                      <w:sz w:val="22"/>
+                      <w:szCs w:val="22"/>
+                    </w:rPr>
+                    <w:t>}</w:t>
+                  </w:r>
                 </w:p>
               </w:tc>
             </w:tr>
@@ -575,7 +705,7 @@
               </w:trPr>
               <w:tc>
                 <w:tcPr>
-                  <w:tcW w:w="400" w:type="dxa"/>
+                  <w:tcW w:w="535" w:type="dxa"/>
                 </w:tcPr>
                 <w:p>
                   <w:pPr>
@@ -586,6 +716,32 @@
                       <w:szCs w:val="22"/>
                     </w:rPr>
                   </w:pPr>
+                  <w:r>
+                    <w:rPr>
+                      <w:rFonts w:ascii="Times New Roman" w:hAnsi="Times New Roman" w:cs="Times New Roman"/>
+                      <w:sz w:val="22"/>
+                      <w:szCs w:val="22"/>
+                    </w:rPr>
+                    <w:t>${</w:t>
+                  </w:r>
+                  <w:proofErr w:type="spellStart"/>
+                  <w:r>
+                    <w:rPr>
+                      <w:rFonts w:ascii="Times New Roman" w:hAnsi="Times New Roman" w:cs="Times New Roman"/>
+                      <w:sz w:val="22"/>
+                      <w:szCs w:val="22"/>
+                    </w:rPr>
+                    <w:t>cea_avr</w:t>
+                  </w:r>
+                  <w:proofErr w:type="spellEnd"/>
+                  <w:r>
+                    <w:rPr>
+                      <w:rFonts w:ascii="Times New Roman" w:hAnsi="Times New Roman" w:cs="Times New Roman"/>
+                      <w:sz w:val="22"/>
+                      <w:szCs w:val="22"/>
+                    </w:rPr>
+                    <w:t>}</w:t>
+                  </w:r>
                 </w:p>
               </w:tc>
             </w:tr>
@@ -595,7 +751,7 @@
               </w:trPr>
               <w:tc>
                 <w:tcPr>
-                  <w:tcW w:w="400" w:type="dxa"/>
+                  <w:tcW w:w="535" w:type="dxa"/>
                 </w:tcPr>
                 <w:p>
                   <w:pPr>
@@ -606,6 +762,48 @@
                       <w:szCs w:val="22"/>
                     </w:rPr>
                   </w:pPr>
+                  <w:r>
+                    <w:rPr>
+                      <w:rFonts w:ascii="Times New Roman" w:hAnsi="Times New Roman" w:cs="Times New Roman"/>
+                      <w:sz w:val="22"/>
+                      <w:szCs w:val="22"/>
+                    </w:rPr>
+                    <w:t>${</w:t>
+                  </w:r>
+                  <w:proofErr w:type="spellStart"/>
+                  <w:r>
+                    <w:rPr>
+                      <w:rFonts w:ascii="Times New Roman" w:hAnsi="Times New Roman" w:cs="Times New Roman"/>
+                      <w:sz w:val="22"/>
+                      <w:szCs w:val="22"/>
+                    </w:rPr>
+                    <w:t>c</w:t>
+                  </w:r>
+                  <w:r>
+                    <w:rPr>
+                      <w:rFonts w:ascii="Times New Roman" w:hAnsi="Times New Roman" w:cs="Times New Roman"/>
+                      <w:sz w:val="22"/>
+                      <w:szCs w:val="22"/>
+                    </w:rPr>
+                    <w:t>ba</w:t>
+                  </w:r>
+                  <w:r>
+                    <w:rPr>
+                      <w:rFonts w:ascii="Times New Roman" w:hAnsi="Times New Roman" w:cs="Times New Roman"/>
+                      <w:sz w:val="22"/>
+                      <w:szCs w:val="22"/>
+                    </w:rPr>
+                    <w:t>_avr</w:t>
+                  </w:r>
+                  <w:proofErr w:type="spellEnd"/>
+                  <w:r>
+                    <w:rPr>
+                      <w:rFonts w:ascii="Times New Roman" w:hAnsi="Times New Roman" w:cs="Times New Roman"/>
+                      <w:sz w:val="22"/>
+                      <w:szCs w:val="22"/>
+                    </w:rPr>
+                    <w:t>}</w:t>
+                  </w:r>
                 </w:p>
               </w:tc>
             </w:tr>
@@ -615,7 +813,7 @@
               </w:trPr>
               <w:tc>
                 <w:tcPr>
-                  <w:tcW w:w="400" w:type="dxa"/>
+                  <w:tcW w:w="535" w:type="dxa"/>
                 </w:tcPr>
                 <w:p>
                   <w:pPr>
@@ -626,20 +824,56 @@
                       <w:szCs w:val="22"/>
                     </w:rPr>
                   </w:pPr>
+                  <w:r>
+                    <w:rPr>
+                      <w:rFonts w:ascii="Times New Roman" w:hAnsi="Times New Roman" w:cs="Times New Roman"/>
+                      <w:sz w:val="22"/>
+                      <w:szCs w:val="22"/>
+                    </w:rPr>
+                    <w:t>${</w:t>
+                  </w:r>
+                  <w:proofErr w:type="spellStart"/>
+                  <w:r>
+                    <w:rPr>
+                      <w:rFonts w:ascii="Times New Roman" w:hAnsi="Times New Roman" w:cs="Times New Roman"/>
+                      <w:sz w:val="22"/>
+                      <w:szCs w:val="22"/>
+                    </w:rPr>
+                    <w:t>new_avr</w:t>
+                  </w:r>
+                  <w:proofErr w:type="spellEnd"/>
+                  <w:r>
+                    <w:rPr>
+                      <w:rFonts w:ascii="Times New Roman" w:hAnsi="Times New Roman" w:cs="Times New Roman"/>
+                      <w:sz w:val="22"/>
+                      <w:szCs w:val="22"/>
+                    </w:rPr>
+                    <w:t>}</w:t>
+                  </w:r>
                 </w:p>
               </w:tc>
             </w:tr>
           </w:tbl>
+          <w:p>
+            <w:pPr>
+              <w:spacing w:line="360" w:lineRule="auto"/>
+              <w:rPr>
+                <w:rFonts w:ascii="Times New Roman" w:hAnsi="Times New Roman" w:cs="Times New Roman"/>
+                <w:sz w:val="22"/>
+                <w:szCs w:val="22"/>
+              </w:rPr>
+            </w:pPr>
+          </w:p>
           <w:tbl>
             <w:tblPr>
               <w:tblStyle w:val="TableGrid"/>
-              <w:tblpPr w:leftFromText="180" w:rightFromText="180" w:vertAnchor="text" w:horzAnchor="page" w:tblpX="6757" w:tblpY="317"/>
+              <w:tblpPr w:leftFromText="180" w:rightFromText="180" w:vertAnchor="text" w:horzAnchor="page" w:tblpX="6841" w:tblpY="-42"/>
               <w:tblOverlap w:val="never"/>
               <w:tblW w:w="0" w:type="auto"/>
               <w:tblLook w:val="04A0" w:firstRow="1" w:lastRow="0" w:firstColumn="1" w:lastColumn="0" w:noHBand="0" w:noVBand="1"/>
             </w:tblPr>
             <w:tblGrid>
-              <w:gridCol w:w="340"/>
+              <w:gridCol w:w="1735"/>
             </w:tblGrid>
             <w:tr>
               <w:trPr>
@@ -647,7 +881,7 @@
               </w:trPr>
               <w:tc>
                 <w:tcPr>
-                  <w:tcW w:w="340" w:type="dxa"/>
+                  <w:tcW w:w="535" w:type="dxa"/>
                 </w:tcPr>
                 <w:p>
                   <w:pPr>
@@ -658,6 +892,14 @@
                       <w:szCs w:val="22"/>
                     </w:rPr>
                   </w:pPr>
+                  <w:r>
+                    <w:rPr>
+                      <w:rFonts w:ascii="Times New Roman" w:hAnsi="Times New Roman" w:cs="Times New Roman"/>
+                      <w:sz w:val="22"/>
+                      <w:szCs w:val="22"/>
+                    </w:rPr>
+                    <w:t>${grandstand}</w:t>
+                  </w:r>
                 </w:p>
               </w:tc>
             </w:tr>
@@ -667,7 +909,7 @@
               </w:trPr>
               <w:tc>
                 <w:tcPr>
-                  <w:tcW w:w="340" w:type="dxa"/>
+                  <w:tcW w:w="535" w:type="dxa"/>
                 </w:tcPr>
                 <w:p>
                   <w:pPr>
@@ -678,6 +920,32 @@
                       <w:szCs w:val="22"/>
                     </w:rPr>
                   </w:pPr>
+                  <w:r>
+                    <w:rPr>
+                      <w:rFonts w:ascii="Times New Roman" w:hAnsi="Times New Roman" w:cs="Times New Roman"/>
+                      <w:sz w:val="22"/>
+                      <w:szCs w:val="22"/>
+                    </w:rPr>
+                    <w:t>${</w:t>
+                  </w:r>
+                  <w:proofErr w:type="spellStart"/>
+                  <w:r>
+                    <w:rPr>
+                      <w:rFonts w:ascii="Times New Roman" w:hAnsi="Times New Roman" w:cs="Times New Roman"/>
+                      <w:sz w:val="22"/>
+                      <w:szCs w:val="22"/>
+                    </w:rPr>
+                    <w:t>covered_gym</w:t>
+                  </w:r>
+                  <w:proofErr w:type="spellEnd"/>
+                  <w:r>
+                    <w:rPr>
+                      <w:rFonts w:ascii="Times New Roman" w:hAnsi="Times New Roman" w:cs="Times New Roman"/>
+                      <w:sz w:val="22"/>
+                      <w:szCs w:val="22"/>
+                    </w:rPr>
+                    <w:t>}</w:t>
+                  </w:r>
                 </w:p>
               </w:tc>
             </w:tr>
@@ -687,7 +955,7 @@
               </w:trPr>
               <w:tc>
                 <w:tcPr>
-                  <w:tcW w:w="340" w:type="dxa"/>
+                  <w:tcW w:w="535" w:type="dxa"/>
                 </w:tcPr>
                 <w:p>
                   <w:pPr>
@@ -698,6 +966,32 @@
                       <w:szCs w:val="22"/>
                     </w:rPr>
                   </w:pPr>
+                  <w:r>
+                    <w:rPr>
+                      <w:rFonts w:ascii="Times New Roman" w:hAnsi="Times New Roman" w:cs="Times New Roman"/>
+                      <w:sz w:val="22"/>
+                      <w:szCs w:val="22"/>
+                    </w:rPr>
+                    <w:t>${</w:t>
+                  </w:r>
+                  <w:proofErr w:type="spellStart"/>
+                  <w:r>
+                    <w:rPr>
+                      <w:rFonts w:ascii="Times New Roman" w:hAnsi="Times New Roman" w:cs="Times New Roman"/>
+                      <w:sz w:val="22"/>
+                      <w:szCs w:val="22"/>
+                    </w:rPr>
+                    <w:t>track_oval</w:t>
+                  </w:r>
+                  <w:proofErr w:type="spellEnd"/>
+                  <w:r>
+                    <w:rPr>
+                      <w:rFonts w:ascii="Times New Roman" w:hAnsi="Times New Roman" w:cs="Times New Roman"/>
+                      <w:sz w:val="22"/>
+                      <w:szCs w:val="22"/>
+                    </w:rPr>
+                    <w:t>}</w:t>
+                  </w:r>
                 </w:p>
               </w:tc>
             </w:tr>
@@ -707,17 +1001,26 @@
               </w:trPr>
               <w:tc>
                 <w:tcPr>
-                  <w:tcW w:w="340" w:type="dxa"/>
+                  <w:tcW w:w="535" w:type="dxa"/>
                 </w:tcPr>
                 <w:p>
                   <w:pPr>
                     <w:spacing w:line="360" w:lineRule="auto"/>
+                    <w:jc w:val="center"/>
                     <w:rPr>
                       <w:rFonts w:ascii="Times New Roman" w:hAnsi="Times New Roman" w:cs="Times New Roman"/>
                       <w:sz w:val="22"/>
                       <w:szCs w:val="22"/>
                     </w:rPr>
                   </w:pPr>
+                  <w:r>
+                    <w:rPr>
+                      <w:rFonts w:ascii="Times New Roman" w:hAnsi="Times New Roman" w:cs="Times New Roman"/>
+                      <w:sz w:val="22"/>
+                      <w:szCs w:val="22"/>
+                    </w:rPr>
+                    <w:t>${others}</w:t>
+                  </w:r>
                 </w:p>
               </w:tc>
             </w:tr>
@@ -731,16 +1034,6 @@
                 <w:szCs w:val="22"/>
               </w:rPr>
             </w:pPr>
-          </w:p>
-          <w:p>
-            <w:pPr>
-              <w:spacing w:line="360" w:lineRule="auto"/>
-              <w:rPr>
-                <w:rFonts w:ascii="Times New Roman" w:hAnsi="Times New Roman" w:cs="Times New Roman"/>
-                <w:sz w:val="22"/>
-                <w:szCs w:val="22"/>
-              </w:rPr>
-            </w:pPr>
             <w:r>
               <w:rPr>
                 <w:rFonts w:ascii="Times New Roman" w:hAnsi="Times New Roman" w:cs="Times New Roman"/>
@@ -750,7 +1043,7 @@
               <w:t xml:space="preserve">BUSALIAN HALL                        ICT AVR                           GRANDSTAND         </w:t>
             </w:r>
             <w:r>
-              <w:t xml:space="preserve"> [${venues_selected}]</w:t>
+              <w:t xml:space="preserve"> </w:t>
             </w:r>
           </w:p>
           <w:p>
@@ -838,7 +1131,43 @@
                 <w:sz w:val="22"/>
                 <w:szCs w:val="22"/>
               </w:rPr>
-              <w:t xml:space="preserve">                                                                                       Please specify: ${venue_others}                                                                         </w:t>
+              <w:t xml:space="preserve">                                                                                       Please specify: ${</w:t>
+            </w:r>
+            <w:proofErr w:type="spellStart"/>
+            <w:r>
+              <w:rPr>
+                <w:rFonts w:ascii="Times New Roman" w:hAnsi="Times New Roman" w:cs="Times New Roman"/>
+                <w:sz w:val="22"/>
+                <w:szCs w:val="22"/>
+              </w:rPr>
+              <w:t>venue_</w:t>
+            </w:r>
+            <w:proofErr w:type="gramStart"/>
+            <w:r>
+              <w:rPr>
+                <w:rFonts w:ascii="Times New Roman" w:hAnsi="Times New Roman" w:cs="Times New Roman"/>
+                <w:sz w:val="22"/>
+                <w:szCs w:val="22"/>
+              </w:rPr>
+              <w:t>others</w:t>
+            </w:r>
+            <w:proofErr w:type="spellEnd"/>
+            <w:r>
+              <w:rPr>
+                <w:rFonts w:ascii="Times New Roman" w:hAnsi="Times New Roman" w:cs="Times New Roman"/>
+                <w:sz w:val="22"/>
+                <w:szCs w:val="22"/>
+              </w:rPr>
+              <w:t xml:space="preserve">}   </w:t>
+            </w:r>
+            <w:proofErr w:type="gramEnd"/>
+            <w:r>
+              <w:rPr>
+                <w:rFonts w:ascii="Times New Roman" w:hAnsi="Times New Roman" w:cs="Times New Roman"/>
+                <w:sz w:val="22"/>
+                <w:szCs w:val="22"/>
+              </w:rPr>
+              <w:t xml:space="preserve">                                                                      </w:t>
             </w:r>
           </w:p>
         </w:tc>
@@ -1707,6 +2036,7 @@
                 <w:sz w:val="22"/>
                 <w:szCs w:val="22"/>
               </w:rPr>
+              <w:lastRenderedPageBreak/>
               <w:t>APPROVED BY:</w:t>
             </w:r>
           </w:p>

</xml_diff>